<commit_message>
Updated ECE Resume to include weather station
</commit_message>
<xml_diff>
--- a/Resume/Rick Unite_ECE_Resume.docx
+++ b/Resume/Rick Unite_ECE_Resume.docx
@@ -1617,51 +1617,21 @@
           <w:sz w:val="20"/>
           <w:szCs w:val="20"/>
         </w:rPr>
-        <w:t xml:space="preserve">FPGA </w:t>
-      </w:r>
-      <w:proofErr w:type="spellStart"/>
-      <w:r>
-        <w:rPr>
-          <w:sz w:val="20"/>
-          <w:szCs w:val="20"/>
-        </w:rPr>
-        <w:t>Debouncer</w:t>
-      </w:r>
-      <w:proofErr w:type="spellEnd"/>
-      <w:r>
-        <w:rPr>
-          <w:sz w:val="20"/>
-          <w:szCs w:val="20"/>
-        </w:rPr>
-        <w:tab/>
-      </w:r>
-      <w:r>
-        <w:rPr>
-          <w:sz w:val="20"/>
-          <w:szCs w:val="20"/>
-        </w:rPr>
-        <w:tab/>
-      </w:r>
-      <w:r>
-        <w:rPr>
-          <w:sz w:val="20"/>
-          <w:szCs w:val="20"/>
-        </w:rPr>
-        <w:tab/>
-      </w:r>
-      <w:r>
-        <w:rPr>
-          <w:sz w:val="20"/>
-          <w:szCs w:val="20"/>
-        </w:rPr>
-        <w:tab/>
-      </w:r>
-      <w:r>
-        <w:rPr>
-          <w:sz w:val="20"/>
-          <w:szCs w:val="20"/>
-        </w:rPr>
-        <w:tab/>
+        <w:t>Northr</w:t>
+      </w:r>
+      <w:r>
+        <w:rPr>
+          <w:sz w:val="20"/>
+          <w:szCs w:val="20"/>
+        </w:rPr>
+        <w:t>o</w:t>
+      </w:r>
+      <w:r>
+        <w:rPr>
+          <w:sz w:val="20"/>
+          <w:szCs w:val="20"/>
+        </w:rPr>
+        <w:t>p Grumman Collaboration Project Weather Station</w:t>
       </w:r>
       <w:r>
         <w:rPr>
@@ -1752,87 +1722,7 @@
           <w:sz w:val="20"/>
           <w:szCs w:val="20"/>
         </w:rPr>
-        <w:t xml:space="preserve">Designed and implemented a switch </w:t>
-      </w:r>
-      <w:proofErr w:type="spellStart"/>
-      <w:r>
-        <w:rPr>
-          <w:sz w:val="20"/>
-          <w:szCs w:val="20"/>
-        </w:rPr>
-        <w:t>debouncer</w:t>
-      </w:r>
-      <w:proofErr w:type="spellEnd"/>
-      <w:r>
-        <w:rPr>
-          <w:sz w:val="20"/>
-          <w:szCs w:val="20"/>
-        </w:rPr>
-        <w:t xml:space="preserve"> module in </w:t>
-      </w:r>
-      <w:proofErr w:type="spellStart"/>
-      <w:r>
-        <w:rPr>
-          <w:sz w:val="20"/>
-          <w:szCs w:val="20"/>
-        </w:rPr>
-        <w:t>SystermVerilog</w:t>
-      </w:r>
-      <w:proofErr w:type="spellEnd"/>
-      <w:r>
-        <w:rPr>
-          <w:sz w:val="20"/>
-          <w:szCs w:val="20"/>
-        </w:rPr>
-        <w:t xml:space="preserve"> on a </w:t>
-      </w:r>
-      <w:proofErr w:type="spellStart"/>
-      <w:r>
-        <w:rPr>
-          <w:sz w:val="20"/>
-          <w:szCs w:val="20"/>
-        </w:rPr>
-        <w:t>Nexys</w:t>
-      </w:r>
-      <w:proofErr w:type="spellEnd"/>
-      <w:r>
-        <w:rPr>
-          <w:sz w:val="20"/>
-          <w:szCs w:val="20"/>
-        </w:rPr>
-        <w:t xml:space="preserve"> A7 FPGA using Xilinx </w:t>
-      </w:r>
-      <w:proofErr w:type="spellStart"/>
-      <w:r>
-        <w:rPr>
-          <w:sz w:val="20"/>
-          <w:szCs w:val="20"/>
-        </w:rPr>
-        <w:t>Vivado</w:t>
-      </w:r>
-      <w:proofErr w:type="spellEnd"/>
-      <w:r>
-        <w:rPr>
-          <w:sz w:val="20"/>
-          <w:szCs w:val="20"/>
-        </w:rPr>
-        <w:t xml:space="preserve"> to </w:t>
-      </w:r>
-      <w:proofErr w:type="spellStart"/>
-      <w:r>
-        <w:rPr>
-          <w:sz w:val="20"/>
-          <w:szCs w:val="20"/>
-        </w:rPr>
-        <w:t>elimnate</w:t>
-      </w:r>
-      <w:proofErr w:type="spellEnd"/>
-      <w:r>
-        <w:rPr>
-          <w:sz w:val="20"/>
-          <w:szCs w:val="20"/>
-        </w:rPr>
-        <w:t xml:space="preserve"> mechanical bounce and ensure stable digital inputs</w:t>
+        <w:t>Worked on the Ground Control Station team for my school’s NGCP, tasked with building a weather station to assist with monitoring data for our search and rescue UAV</w:t>
       </w:r>
     </w:p>
     <w:p>
@@ -1853,7 +1743,44 @@
           <w:sz w:val="20"/>
           <w:szCs w:val="20"/>
         </w:rPr>
-        <w:t>Used an oscilloscope to probe switch input signals and verify debouncing performance, analyzing waveform timing and confirming elimination of transient noise before and after FPGA processing</w:t>
+        <w:t>Designed and built an ESP32 based weather station integrating multiple sensors, photo resistor, temperature, humidity, wind speed and direction sensors to collect and process real-time environmental data</w:t>
+      </w:r>
+    </w:p>
+    <w:p>
+      <w:pPr>
+        <w:numPr>
+          <w:ilvl w:val="0"/>
+          <w:numId w:val="4"/>
+        </w:numPr>
+        <w:spacing w:line="240" w:lineRule="auto"/>
+        <w:ind w:right="0" w:hanging="360"/>
+        <w:rPr>
+          <w:sz w:val="20"/>
+          <w:szCs w:val="20"/>
+        </w:rPr>
+      </w:pPr>
+      <w:r>
+        <w:rPr>
+          <w:sz w:val="20"/>
+          <w:szCs w:val="20"/>
+        </w:rPr>
+        <w:t xml:space="preserve">Created a schematic on </w:t>
+      </w:r>
+      <w:proofErr w:type="spellStart"/>
+      <w:r>
+        <w:rPr>
+          <w:sz w:val="20"/>
+          <w:szCs w:val="20"/>
+        </w:rPr>
+        <w:t>KiCad</w:t>
+      </w:r>
+      <w:proofErr w:type="spellEnd"/>
+      <w:r>
+        <w:rPr>
+          <w:sz w:val="20"/>
+          <w:szCs w:val="20"/>
+        </w:rPr>
+        <w:t xml:space="preserve"> and ordered a personal PCB board</w:t>
       </w:r>
     </w:p>
     <w:p>
@@ -1955,7 +1882,21 @@
           <w:sz w:val="20"/>
           <w:szCs w:val="20"/>
         </w:rPr>
-        <w:t>Nov’ 24</w:t>
+        <w:t>Apr ’</w:t>
+      </w:r>
+      <w:r>
+        <w:rPr>
+          <w:sz w:val="20"/>
+          <w:szCs w:val="20"/>
+        </w:rPr>
+        <w:t>2</w:t>
+      </w:r>
+      <w:r>
+        <w:rPr>
+          <w:sz w:val="20"/>
+          <w:szCs w:val="20"/>
+        </w:rPr>
+        <w:t>5</w:t>
       </w:r>
     </w:p>
     <w:p>

</xml_diff>